<commit_message>
Add unit tests for payload service, search functionality, system events, and vessel service; implement WebSocket for system notifications
- Created unit tests for `PayloadTypeService` covering list, get, create, update, and delete operations.
- Added unit tests for Elasticsearch client and indexing helpers in `search.py`, ensuring graceful degradation on errors.
- Implemented unit tests for WebSocket broadcast channel in `system_events.py`, verifying message delivery to subscribers.
- Developed unit tests for `NavalVesselService`, testing CRUD operations, position updates, and drone assignments.
- Introduced a new WebSocket connection in `systemEventsStore.ts` for backend-initiated system notices, enhancing UI responsiveness.
- Documented implementation status and bottlenecks for the DroneArjuna project in `DA-Implementation-Status-and-Bottlenecks.md`.
</commit_message>
<xml_diff>
--- a/backend/app/tests/reports/modules/test_access_requests_api_documentation.docx
+++ b/backend/app/tests/reports/modules/test_access_requests_api_documentation.docx
@@ -12,12 +12,12 @@
     </w:p>
     <w:p>
       <w:r>
-        <w:t>Generated at: 2026-07-10T05:01:59+00:00</w:t>
+        <w:t>Generated at: 2026-08-24T06:23:16+00:00</w:t>
       </w:r>
     </w:p>
     <w:p>
       <w:r>
-        <w:t>Test session started: 2026-07-10T04:58:46+00:00</w:t>
+        <w:t>Test session started: 2026-08-24T06:13:20+00:00</w:t>
       </w:r>
     </w:p>
     <w:p>
@@ -200,7 +200,7 @@
     </w:p>
     <w:p>
       <w:r>
-        <w:t>Source file: /app/app/tests/test_access_requests_api.py</w:t>
+        <w:t>Source file: C:\Users\Chandrasekhar\Downloads\DroneArjuna_final\DroneArjuna\backend\app\tests\test_access_requests_api.py</w:t>
       </w:r>
     </w:p>
     <w:tbl>
@@ -348,7 +348,7 @@
           </w:tcPr>
           <w:p>
             <w:r>
-              <w:t>0.653</w:t>
+              <w:t>0.770</w:t>
             </w:r>
           </w:p>
         </w:tc>
@@ -420,7 +420,7 @@
           </w:tcPr>
           <w:p>
             <w:r>
-              <w:t>0.590</w:t>
+              <w:t>0.776</w:t>
             </w:r>
           </w:p>
         </w:tc>
@@ -492,7 +492,7 @@
           </w:tcPr>
           <w:p>
             <w:r>
-              <w:t>0.602</w:t>
+              <w:t>0.792</w:t>
             </w:r>
           </w:p>
         </w:tc>
@@ -564,7 +564,7 @@
           </w:tcPr>
           <w:p>
             <w:r>
-              <w:t>0.347</w:t>
+              <w:t>0.403</w:t>
             </w:r>
           </w:p>
         </w:tc>
@@ -636,7 +636,7 @@
           </w:tcPr>
           <w:p>
             <w:r>
-              <w:t>0.355</w:t>
+              <w:t>0.450</w:t>
             </w:r>
           </w:p>
         </w:tc>
@@ -708,7 +708,7 @@
           </w:tcPr>
           <w:p>
             <w:r>
-              <w:t>0.685</w:t>
+              <w:t>0.832</w:t>
             </w:r>
           </w:p>
         </w:tc>
@@ -780,7 +780,7 @@
           </w:tcPr>
           <w:p>
             <w:r>
-              <w:t>0.922</w:t>
+              <w:t>1.287</w:t>
             </w:r>
           </w:p>
         </w:tc>
@@ -852,7 +852,7 @@
           </w:tcPr>
           <w:p>
             <w:r>
-              <w:t>1.064</w:t>
+              <w:t>1.243</w:t>
             </w:r>
           </w:p>
         </w:tc>
@@ -924,7 +924,7 @@
           </w:tcPr>
           <w:p>
             <w:r>
-              <w:t>0.305</w:t>
+              <w:t>0.428</w:t>
             </w:r>
           </w:p>
         </w:tc>
@@ -996,6 +996,294 @@
           </w:tcPr>
           <w:p>
             <w:r>
+              <w:t>0.040</w:t>
+            </w:r>
+          </w:p>
+        </w:tc>
+        <w:tc>
+          <w:tcPr>
+            <w:tcW w:w="2400" w:type="dxa"/>
+          </w:tcPr>
+          <w:p>
+            <w:r>
+              <w:t>asyncio</w:t>
+            </w:r>
+          </w:p>
+        </w:tc>
+        <w:tc>
+          <w:tcPr>
+            <w:tcW w:w="2400" w:type="dxa"/>
+          </w:tcPr>
+          <w:p>
+            <w:r>
+              <w:t>-</w:t>
+            </w:r>
+          </w:p>
+        </w:tc>
+      </w:tr>
+      <w:tr>
+        <w:tc>
+          <w:tcPr>
+            <w:tcW w:w="2400" w:type="dxa"/>
+          </w:tcPr>
+          <w:p>
+            <w:r>
+              <w:t>11</w:t>
+            </w:r>
+          </w:p>
+        </w:tc>
+        <w:tc>
+          <w:tcPr>
+            <w:tcW w:w="2400" w:type="dxa"/>
+          </w:tcPr>
+          <w:p>
+            <w:r>
+              <w:t>test_invalid_email_format_is_422</w:t>
+            </w:r>
+          </w:p>
+        </w:tc>
+        <w:tc>
+          <w:tcPr>
+            <w:tcW w:w="2400" w:type="dxa"/>
+          </w:tcPr>
+          <w:p>
+            <w:r>
+              <w:t>A non-email string in the email field → 422 (EmailStr validation).</w:t>
+            </w:r>
+          </w:p>
+        </w:tc>
+        <w:tc>
+          <w:tcPr>
+            <w:tcW w:w="2400" w:type="dxa"/>
+          </w:tcPr>
+          <w:p>
+            <w:r>
+              <w:t>Passed</w:t>
+            </w:r>
+          </w:p>
+        </w:tc>
+        <w:tc>
+          <w:tcPr>
+            <w:tcW w:w="2400" w:type="dxa"/>
+          </w:tcPr>
+          <w:p>
+            <w:r>
+              <w:t>0.028</w:t>
+            </w:r>
+          </w:p>
+        </w:tc>
+        <w:tc>
+          <w:tcPr>
+            <w:tcW w:w="2400" w:type="dxa"/>
+          </w:tcPr>
+          <w:p>
+            <w:r>
+              <w:t>asyncio</w:t>
+            </w:r>
+          </w:p>
+        </w:tc>
+        <w:tc>
+          <w:tcPr>
+            <w:tcW w:w="2400" w:type="dxa"/>
+          </w:tcPr>
+          <w:p>
+            <w:r>
+              <w:t>-</w:t>
+            </w:r>
+          </w:p>
+        </w:tc>
+      </w:tr>
+      <w:tr>
+        <w:tc>
+          <w:tcPr>
+            <w:tcW w:w="2400" w:type="dxa"/>
+          </w:tcPr>
+          <w:p>
+            <w:r>
+              <w:t>12</w:t>
+            </w:r>
+          </w:p>
+        </w:tc>
+        <w:tc>
+          <w:tcPr>
+            <w:tcW w:w="2400" w:type="dxa"/>
+          </w:tcPr>
+          <w:p>
+            <w:r>
+              <w:t>test_list_requests_empty_when_none_submitted</w:t>
+            </w:r>
+          </w:p>
+        </w:tc>
+        <w:tc>
+          <w:tcPr>
+            <w:tcW w:w="2400" w:type="dxa"/>
+          </w:tcPr>
+          <w:p>
+            <w:r>
+              <w:t>When no requests exist the endpoint must return 200 with an empty list, | not 404.</w:t>
+            </w:r>
+          </w:p>
+        </w:tc>
+        <w:tc>
+          <w:tcPr>
+            <w:tcW w:w="2400" w:type="dxa"/>
+          </w:tcPr>
+          <w:p>
+            <w:r>
+              <w:t>Passed</w:t>
+            </w:r>
+          </w:p>
+        </w:tc>
+        <w:tc>
+          <w:tcPr>
+            <w:tcW w:w="2400" w:type="dxa"/>
+          </w:tcPr>
+          <w:p>
+            <w:r>
+              <w:t>0.377</w:t>
+            </w:r>
+          </w:p>
+        </w:tc>
+        <w:tc>
+          <w:tcPr>
+            <w:tcW w:w="2400" w:type="dxa"/>
+          </w:tcPr>
+          <w:p>
+            <w:r>
+              <w:t>asyncio</w:t>
+            </w:r>
+          </w:p>
+        </w:tc>
+        <w:tc>
+          <w:tcPr>
+            <w:tcW w:w="2400" w:type="dxa"/>
+          </w:tcPr>
+          <w:p>
+            <w:r>
+              <w:t>-</w:t>
+            </w:r>
+          </w:p>
+        </w:tc>
+      </w:tr>
+      <w:tr>
+        <w:tc>
+          <w:tcPr>
+            <w:tcW w:w="2400" w:type="dxa"/>
+          </w:tcPr>
+          <w:p>
+            <w:r>
+              <w:t>13</w:t>
+            </w:r>
+          </w:p>
+        </w:tc>
+        <w:tc>
+          <w:tcPr>
+            <w:tcW w:w="2400" w:type="dxa"/>
+          </w:tcPr>
+          <w:p>
+            <w:r>
+              <w:t>test_missing_email_is_422</w:t>
+            </w:r>
+          </w:p>
+        </w:tc>
+        <w:tc>
+          <w:tcPr>
+            <w:tcW w:w="2400" w:type="dxa"/>
+          </w:tcPr>
+          <w:p>
+            <w:r>
+              <w:t>Required field 'email' missing → 422.</w:t>
+            </w:r>
+          </w:p>
+        </w:tc>
+        <w:tc>
+          <w:tcPr>
+            <w:tcW w:w="2400" w:type="dxa"/>
+          </w:tcPr>
+          <w:p>
+            <w:r>
+              <w:t>Passed</w:t>
+            </w:r>
+          </w:p>
+        </w:tc>
+        <w:tc>
+          <w:tcPr>
+            <w:tcW w:w="2400" w:type="dxa"/>
+          </w:tcPr>
+          <w:p>
+            <w:r>
+              <w:t>0.028</w:t>
+            </w:r>
+          </w:p>
+        </w:tc>
+        <w:tc>
+          <w:tcPr>
+            <w:tcW w:w="2400" w:type="dxa"/>
+          </w:tcPr>
+          <w:p>
+            <w:r>
+              <w:t>asyncio</w:t>
+            </w:r>
+          </w:p>
+        </w:tc>
+        <w:tc>
+          <w:tcPr>
+            <w:tcW w:w="2400" w:type="dxa"/>
+          </w:tcPr>
+          <w:p>
+            <w:r>
+              <w:t>-</w:t>
+            </w:r>
+          </w:p>
+        </w:tc>
+      </w:tr>
+      <w:tr>
+        <w:tc>
+          <w:tcPr>
+            <w:tcW w:w="2400" w:type="dxa"/>
+          </w:tcPr>
+          <w:p>
+            <w:r>
+              <w:t>14</w:t>
+            </w:r>
+          </w:p>
+        </w:tc>
+        <w:tc>
+          <w:tcPr>
+            <w:tcW w:w="2400" w:type="dxa"/>
+          </w:tcPr>
+          <w:p>
+            <w:r>
+              <w:t>test_missing_full_name_is_422</w:t>
+            </w:r>
+          </w:p>
+        </w:tc>
+        <w:tc>
+          <w:tcPr>
+            <w:tcW w:w="2400" w:type="dxa"/>
+          </w:tcPr>
+          <w:p>
+            <w:r>
+              <w:t>Required field 'full_name' missing → 422.</w:t>
+            </w:r>
+          </w:p>
+        </w:tc>
+        <w:tc>
+          <w:tcPr>
+            <w:tcW w:w="2400" w:type="dxa"/>
+          </w:tcPr>
+          <w:p>
+            <w:r>
+              <w:t>Passed</w:t>
+            </w:r>
+          </w:p>
+        </w:tc>
+        <w:tc>
+          <w:tcPr>
+            <w:tcW w:w="2400" w:type="dxa"/>
+          </w:tcPr>
+          <w:p>
+            <w:r>
               <w:t>0.027</w:t>
             </w:r>
           </w:p>
@@ -1028,294 +1316,6 @@
           </w:tcPr>
           <w:p>
             <w:r>
-              <w:t>11</w:t>
-            </w:r>
-          </w:p>
-        </w:tc>
-        <w:tc>
-          <w:tcPr>
-            <w:tcW w:w="2400" w:type="dxa"/>
-          </w:tcPr>
-          <w:p>
-            <w:r>
-              <w:t>test_invalid_email_format_is_422</w:t>
-            </w:r>
-          </w:p>
-        </w:tc>
-        <w:tc>
-          <w:tcPr>
-            <w:tcW w:w="2400" w:type="dxa"/>
-          </w:tcPr>
-          <w:p>
-            <w:r>
-              <w:t>A non-email string in the email field → 422 (EmailStr validation).</w:t>
-            </w:r>
-          </w:p>
-        </w:tc>
-        <w:tc>
-          <w:tcPr>
-            <w:tcW w:w="2400" w:type="dxa"/>
-          </w:tcPr>
-          <w:p>
-            <w:r>
-              <w:t>Passed</w:t>
-            </w:r>
-          </w:p>
-        </w:tc>
-        <w:tc>
-          <w:tcPr>
-            <w:tcW w:w="2400" w:type="dxa"/>
-          </w:tcPr>
-          <w:p>
-            <w:r>
-              <w:t>0.012</w:t>
-            </w:r>
-          </w:p>
-        </w:tc>
-        <w:tc>
-          <w:tcPr>
-            <w:tcW w:w="2400" w:type="dxa"/>
-          </w:tcPr>
-          <w:p>
-            <w:r>
-              <w:t>asyncio</w:t>
-            </w:r>
-          </w:p>
-        </w:tc>
-        <w:tc>
-          <w:tcPr>
-            <w:tcW w:w="2400" w:type="dxa"/>
-          </w:tcPr>
-          <w:p>
-            <w:r>
-              <w:t>-</w:t>
-            </w:r>
-          </w:p>
-        </w:tc>
-      </w:tr>
-      <w:tr>
-        <w:tc>
-          <w:tcPr>
-            <w:tcW w:w="2400" w:type="dxa"/>
-          </w:tcPr>
-          <w:p>
-            <w:r>
-              <w:t>12</w:t>
-            </w:r>
-          </w:p>
-        </w:tc>
-        <w:tc>
-          <w:tcPr>
-            <w:tcW w:w="2400" w:type="dxa"/>
-          </w:tcPr>
-          <w:p>
-            <w:r>
-              <w:t>test_list_requests_empty_when_none_submitted</w:t>
-            </w:r>
-          </w:p>
-        </w:tc>
-        <w:tc>
-          <w:tcPr>
-            <w:tcW w:w="2400" w:type="dxa"/>
-          </w:tcPr>
-          <w:p>
-            <w:r>
-              <w:t>When no requests exist the endpoint must return 200 with an empty list, | not 404.</w:t>
-            </w:r>
-          </w:p>
-        </w:tc>
-        <w:tc>
-          <w:tcPr>
-            <w:tcW w:w="2400" w:type="dxa"/>
-          </w:tcPr>
-          <w:p>
-            <w:r>
-              <w:t>Passed</w:t>
-            </w:r>
-          </w:p>
-        </w:tc>
-        <w:tc>
-          <w:tcPr>
-            <w:tcW w:w="2400" w:type="dxa"/>
-          </w:tcPr>
-          <w:p>
-            <w:r>
-              <w:t>0.306</w:t>
-            </w:r>
-          </w:p>
-        </w:tc>
-        <w:tc>
-          <w:tcPr>
-            <w:tcW w:w="2400" w:type="dxa"/>
-          </w:tcPr>
-          <w:p>
-            <w:r>
-              <w:t>asyncio</w:t>
-            </w:r>
-          </w:p>
-        </w:tc>
-        <w:tc>
-          <w:tcPr>
-            <w:tcW w:w="2400" w:type="dxa"/>
-          </w:tcPr>
-          <w:p>
-            <w:r>
-              <w:t>-</w:t>
-            </w:r>
-          </w:p>
-        </w:tc>
-      </w:tr>
-      <w:tr>
-        <w:tc>
-          <w:tcPr>
-            <w:tcW w:w="2400" w:type="dxa"/>
-          </w:tcPr>
-          <w:p>
-            <w:r>
-              <w:t>13</w:t>
-            </w:r>
-          </w:p>
-        </w:tc>
-        <w:tc>
-          <w:tcPr>
-            <w:tcW w:w="2400" w:type="dxa"/>
-          </w:tcPr>
-          <w:p>
-            <w:r>
-              <w:t>test_missing_email_is_422</w:t>
-            </w:r>
-          </w:p>
-        </w:tc>
-        <w:tc>
-          <w:tcPr>
-            <w:tcW w:w="2400" w:type="dxa"/>
-          </w:tcPr>
-          <w:p>
-            <w:r>
-              <w:t>Required field 'email' missing → 422.</w:t>
-            </w:r>
-          </w:p>
-        </w:tc>
-        <w:tc>
-          <w:tcPr>
-            <w:tcW w:w="2400" w:type="dxa"/>
-          </w:tcPr>
-          <w:p>
-            <w:r>
-              <w:t>Passed</w:t>
-            </w:r>
-          </w:p>
-        </w:tc>
-        <w:tc>
-          <w:tcPr>
-            <w:tcW w:w="2400" w:type="dxa"/>
-          </w:tcPr>
-          <w:p>
-            <w:r>
-              <w:t>0.024</w:t>
-            </w:r>
-          </w:p>
-        </w:tc>
-        <w:tc>
-          <w:tcPr>
-            <w:tcW w:w="2400" w:type="dxa"/>
-          </w:tcPr>
-          <w:p>
-            <w:r>
-              <w:t>asyncio</w:t>
-            </w:r>
-          </w:p>
-        </w:tc>
-        <w:tc>
-          <w:tcPr>
-            <w:tcW w:w="2400" w:type="dxa"/>
-          </w:tcPr>
-          <w:p>
-            <w:r>
-              <w:t>-</w:t>
-            </w:r>
-          </w:p>
-        </w:tc>
-      </w:tr>
-      <w:tr>
-        <w:tc>
-          <w:tcPr>
-            <w:tcW w:w="2400" w:type="dxa"/>
-          </w:tcPr>
-          <w:p>
-            <w:r>
-              <w:t>14</w:t>
-            </w:r>
-          </w:p>
-        </w:tc>
-        <w:tc>
-          <w:tcPr>
-            <w:tcW w:w="2400" w:type="dxa"/>
-          </w:tcPr>
-          <w:p>
-            <w:r>
-              <w:t>test_missing_full_name_is_422</w:t>
-            </w:r>
-          </w:p>
-        </w:tc>
-        <w:tc>
-          <w:tcPr>
-            <w:tcW w:w="2400" w:type="dxa"/>
-          </w:tcPr>
-          <w:p>
-            <w:r>
-              <w:t>Required field 'full_name' missing → 422.</w:t>
-            </w:r>
-          </w:p>
-        </w:tc>
-        <w:tc>
-          <w:tcPr>
-            <w:tcW w:w="2400" w:type="dxa"/>
-          </w:tcPr>
-          <w:p>
-            <w:r>
-              <w:t>Passed</w:t>
-            </w:r>
-          </w:p>
-        </w:tc>
-        <w:tc>
-          <w:tcPr>
-            <w:tcW w:w="2400" w:type="dxa"/>
-          </w:tcPr>
-          <w:p>
-            <w:r>
-              <w:t>0.023</w:t>
-            </w:r>
-          </w:p>
-        </w:tc>
-        <w:tc>
-          <w:tcPr>
-            <w:tcW w:w="2400" w:type="dxa"/>
-          </w:tcPr>
-          <w:p>
-            <w:r>
-              <w:t>asyncio</w:t>
-            </w:r>
-          </w:p>
-        </w:tc>
-        <w:tc>
-          <w:tcPr>
-            <w:tcW w:w="2400" w:type="dxa"/>
-          </w:tcPr>
-          <w:p>
-            <w:r>
-              <w:t>-</w:t>
-            </w:r>
-          </w:p>
-        </w:tc>
-      </w:tr>
-      <w:tr>
-        <w:tc>
-          <w:tcPr>
-            <w:tcW w:w="2400" w:type="dxa"/>
-          </w:tcPr>
-          <w:p>
-            <w:r>
               <w:t>15</w:t>
             </w:r>
           </w:p>
@@ -1356,7 +1356,7 @@
           </w:tcPr>
           <w:p>
             <w:r>
-              <w:t>0.025</w:t>
+              <w:t>0.028</w:t>
             </w:r>
           </w:p>
         </w:tc>
@@ -1428,7 +1428,7 @@
           </w:tcPr>
           <w:p>
             <w:r>
-              <w:t>0.324</w:t>
+              <w:t>0.556</w:t>
             </w:r>
           </w:p>
         </w:tc>
@@ -1500,7 +1500,7 @@
           </w:tcPr>
           <w:p>
             <w:r>
-              <w:t>0.303</w:t>
+              <w:t>0.400</w:t>
             </w:r>
           </w:p>
         </w:tc>
@@ -1572,7 +1572,7 @@
           </w:tcPr>
           <w:p>
             <w:r>
-              <w:t>0.320</w:t>
+              <w:t>0.404</w:t>
             </w:r>
           </w:p>
         </w:tc>
@@ -1644,7 +1644,7 @@
           </w:tcPr>
           <w:p>
             <w:r>
-              <w:t>0.319</w:t>
+              <w:t>0.527</w:t>
             </w:r>
           </w:p>
         </w:tc>
@@ -1716,7 +1716,7 @@
           </w:tcPr>
           <w:p>
             <w:r>
-              <w:t>0.610</w:t>
+              <w:t>0.770</w:t>
             </w:r>
           </w:p>
         </w:tc>
@@ -1788,7 +1788,7 @@
           </w:tcPr>
           <w:p>
             <w:r>
-              <w:t>0.322</w:t>
+              <w:t>0.435</w:t>
             </w:r>
           </w:p>
         </w:tc>
@@ -1860,7 +1860,7 @@
           </w:tcPr>
           <w:p>
             <w:r>
-              <w:t>0.308</w:t>
+              <w:t>0.447</w:t>
             </w:r>
           </w:p>
         </w:tc>
@@ -1932,7 +1932,7 @@
           </w:tcPr>
           <w:p>
             <w:r>
-              <w:t>0.327</w:t>
+              <w:t>0.401</w:t>
             </w:r>
           </w:p>
         </w:tc>
@@ -2004,7 +2004,7 @@
           </w:tcPr>
           <w:p>
             <w:r>
-              <w:t>0.350</w:t>
+              <w:t>0.438</w:t>
             </w:r>
           </w:p>
         </w:tc>
@@ -2076,7 +2076,7 @@
           </w:tcPr>
           <w:p>
             <w:r>
-              <w:t>0.614</w:t>
+              <w:t>0.963</w:t>
             </w:r>
           </w:p>
         </w:tc>
@@ -2148,7 +2148,7 @@
           </w:tcPr>
           <w:p>
             <w:r>
-              <w:t>0.320</w:t>
+              <w:t>0.481</w:t>
             </w:r>
           </w:p>
         </w:tc>
@@ -2220,7 +2220,7 @@
           </w:tcPr>
           <w:p>
             <w:r>
-              <w:t>0.755</w:t>
+              <w:t>3.551</w:t>
             </w:r>
           </w:p>
         </w:tc>
@@ -2292,7 +2292,7 @@
           </w:tcPr>
           <w:p>
             <w:r>
-              <w:t>0.349</w:t>
+              <w:t>0.816</w:t>
             </w:r>
           </w:p>
         </w:tc>
@@ -2364,7 +2364,7 @@
           </w:tcPr>
           <w:p>
             <w:r>
-              <w:t>0.034</w:t>
+              <w:t>0.036</w:t>
             </w:r>
           </w:p>
         </w:tc>
@@ -2436,7 +2436,7 @@
           </w:tcPr>
           <w:p>
             <w:r>
-              <w:t>0.023</w:t>
+              <w:t>0.027</w:t>
             </w:r>
           </w:p>
         </w:tc>
@@ -2508,7 +2508,7 @@
           </w:tcPr>
           <w:p>
             <w:r>
-              <w:t>0.027</w:t>
+              <w:t>0.050</w:t>
             </w:r>
           </w:p>
         </w:tc>

</xml_diff>

<commit_message>
feat: add SecuritySettings component for MFA management
</commit_message>
<xml_diff>
--- a/backend/app/tests/reports/modules/test_access_requests_api_documentation.docx
+++ b/backend/app/tests/reports/modules/test_access_requests_api_documentation.docx
@@ -12,12 +12,12 @@
     </w:p>
     <w:p>
       <w:r>
-        <w:t>Generated at: 2026-08-24T06:23:16+00:00</w:t>
+        <w:t>Generated at: 2026-10-01T13:06:01+00:00</w:t>
       </w:r>
     </w:p>
     <w:p>
       <w:r>
-        <w:t>Test session started: 2026-08-24T06:13:20+00:00</w:t>
+        <w:t>Test session started: 2026-10-01T13:05:36+00:00</w:t>
       </w:r>
     </w:p>
     <w:p>
@@ -348,7 +348,7 @@
           </w:tcPr>
           <w:p>
             <w:r>
-              <w:t>0.770</w:t>
+              <w:t>0.635</w:t>
             </w:r>
           </w:p>
         </w:tc>
@@ -420,7 +420,7 @@
           </w:tcPr>
           <w:p>
             <w:r>
-              <w:t>0.776</w:t>
+              <w:t>0.616</w:t>
             </w:r>
           </w:p>
         </w:tc>
@@ -492,7 +492,7 @@
           </w:tcPr>
           <w:p>
             <w:r>
-              <w:t>0.792</w:t>
+              <w:t>0.590</w:t>
             </w:r>
           </w:p>
         </w:tc>
@@ -564,7 +564,7 @@
           </w:tcPr>
           <w:p>
             <w:r>
-              <w:t>0.403</w:t>
+              <w:t>0.334</w:t>
             </w:r>
           </w:p>
         </w:tc>
@@ -636,7 +636,7 @@
           </w:tcPr>
           <w:p>
             <w:r>
-              <w:t>0.450</w:t>
+              <w:t>0.326</w:t>
             </w:r>
           </w:p>
         </w:tc>
@@ -708,7 +708,7 @@
           </w:tcPr>
           <w:p>
             <w:r>
-              <w:t>0.832</w:t>
+              <w:t>0.605</w:t>
             </w:r>
           </w:p>
         </w:tc>
@@ -780,7 +780,7 @@
           </w:tcPr>
           <w:p>
             <w:r>
-              <w:t>1.287</w:t>
+              <w:t>0.917</w:t>
             </w:r>
           </w:p>
         </w:tc>
@@ -852,7 +852,7 @@
           </w:tcPr>
           <w:p>
             <w:r>
-              <w:t>1.243</w:t>
+              <w:t>0.870</w:t>
             </w:r>
           </w:p>
         </w:tc>
@@ -924,7 +924,7 @@
           </w:tcPr>
           <w:p>
             <w:r>
-              <w:t>0.428</w:t>
+              <w:t>0.363</w:t>
             </w:r>
           </w:p>
         </w:tc>
@@ -966,7 +966,7 @@
           </w:tcPr>
           <w:p>
             <w:r>
-              <w:t>test_duplicate_pending_username_is_409</w:t>
+              <w:t>test_duplicate_pending_username_is_generic</w:t>
             </w:r>
           </w:p>
         </w:tc>
@@ -996,7 +996,7 @@
           </w:tcPr>
           <w:p>
             <w:r>
-              <w:t>0.040</w:t>
+              <w:t>0.046</w:t>
             </w:r>
           </w:p>
         </w:tc>
@@ -1068,7 +1068,7 @@
           </w:tcPr>
           <w:p>
             <w:r>
-              <w:t>0.028</w:t>
+              <w:t>0.025</w:t>
             </w:r>
           </w:p>
         </w:tc>
@@ -1140,7 +1140,7 @@
           </w:tcPr>
           <w:p>
             <w:r>
-              <w:t>0.377</w:t>
+              <w:t>0.347</w:t>
             </w:r>
           </w:p>
         </w:tc>
@@ -1212,7 +1212,7 @@
           </w:tcPr>
           <w:p>
             <w:r>
-              <w:t>0.028</w:t>
+              <w:t>0.031</w:t>
             </w:r>
           </w:p>
         </w:tc>
@@ -1284,7 +1284,7 @@
           </w:tcPr>
           <w:p>
             <w:r>
-              <w:t>0.027</w:t>
+              <w:t>0.031</w:t>
             </w:r>
           </w:p>
         </w:tc>
@@ -1356,7 +1356,7 @@
           </w:tcPr>
           <w:p>
             <w:r>
-              <w:t>0.028</w:t>
+              <w:t>0.029</w:t>
             </w:r>
           </w:p>
         </w:tc>
@@ -1428,7 +1428,7 @@
           </w:tcPr>
           <w:p>
             <w:r>
-              <w:t>0.556</w:t>
+              <w:t>0.323</w:t>
             </w:r>
           </w:p>
         </w:tc>
@@ -1500,7 +1500,7 @@
           </w:tcPr>
           <w:p>
             <w:r>
-              <w:t>0.400</w:t>
+              <w:t>0.331</w:t>
             </w:r>
           </w:p>
         </w:tc>
@@ -1572,7 +1572,7 @@
           </w:tcPr>
           <w:p>
             <w:r>
-              <w:t>0.404</w:t>
+              <w:t>0.317</w:t>
             </w:r>
           </w:p>
         </w:tc>
@@ -1644,7 +1644,7 @@
           </w:tcPr>
           <w:p>
             <w:r>
-              <w:t>0.527</w:t>
+              <w:t>0.348</w:t>
             </w:r>
           </w:p>
         </w:tc>
@@ -1716,7 +1716,7 @@
           </w:tcPr>
           <w:p>
             <w:r>
-              <w:t>0.770</w:t>
+              <w:t>0.642</w:t>
             </w:r>
           </w:p>
         </w:tc>
@@ -1788,7 +1788,7 @@
           </w:tcPr>
           <w:p>
             <w:r>
-              <w:t>0.435</w:t>
+              <w:t>0.305</w:t>
             </w:r>
           </w:p>
         </w:tc>
@@ -1860,7 +1860,7 @@
           </w:tcPr>
           <w:p>
             <w:r>
-              <w:t>0.447</w:t>
+              <w:t>0.309</w:t>
             </w:r>
           </w:p>
         </w:tc>
@@ -1932,7 +1932,7 @@
           </w:tcPr>
           <w:p>
             <w:r>
-              <w:t>0.401</w:t>
+              <w:t>0.321</w:t>
             </w:r>
           </w:p>
         </w:tc>
@@ -2004,7 +2004,7 @@
           </w:tcPr>
           <w:p>
             <w:r>
-              <w:t>0.438</w:t>
+              <w:t>0.305</w:t>
             </w:r>
           </w:p>
         </w:tc>
@@ -2076,7 +2076,7 @@
           </w:tcPr>
           <w:p>
             <w:r>
-              <w:t>0.963</w:t>
+              <w:t>0.676</w:t>
             </w:r>
           </w:p>
         </w:tc>
@@ -2148,7 +2148,7 @@
           </w:tcPr>
           <w:p>
             <w:r>
-              <w:t>0.481</w:t>
+              <w:t>0.337</w:t>
             </w:r>
           </w:p>
         </w:tc>
@@ -2220,7 +2220,7 @@
           </w:tcPr>
           <w:p>
             <w:r>
-              <w:t>3.551</w:t>
+              <w:t>2.805</w:t>
             </w:r>
           </w:p>
         </w:tc>
@@ -2292,7 +2292,7 @@
           </w:tcPr>
           <w:p>
             <w:r>
-              <w:t>0.816</w:t>
+              <w:t>0.348</w:t>
             </w:r>
           </w:p>
         </w:tc>
@@ -2364,7 +2364,7 @@
           </w:tcPr>
           <w:p>
             <w:r>
-              <w:t>0.036</w:t>
+              <w:t>0.031</w:t>
             </w:r>
           </w:p>
         </w:tc>
@@ -2436,7 +2436,7 @@
           </w:tcPr>
           <w:p>
             <w:r>
-              <w:t>0.027</w:t>
+              <w:t>0.018</w:t>
             </w:r>
           </w:p>
         </w:tc>
@@ -2508,7 +2508,7 @@
           </w:tcPr>
           <w:p>
             <w:r>
-              <w:t>0.050</w:t>
+              <w:t>0.022</w:t>
             </w:r>
           </w:p>
         </w:tc>

</xml_diff>